<commit_message>
design(pitch): beautify presentation slides with modern high-contrast cards, segoe ui typography, and side-by-side cockpit layout
</commit_message>
<xml_diff>
--- a/submission_files/OmniCare_AI_Brief_Project_Description.docx
+++ b/submission_files/OmniCare_AI_Brief_Project_Description.docx
@@ -119,7 +119,7 @@
             </w:r>
             <w:r>
               <w:rPr>
-                <w:color w:val="00C8FF"/>
+                <w:color w:val="00E5FF"/>
                 <w:sz w:val="14"/>
               </w:rPr>
               <w:t>Qualcomm</w:t>
@@ -149,7 +149,7 @@
             </w:r>
             <w:r>
               <w:rPr>
-                <w:color w:val="00C8FF"/>
+                <w:color w:val="00E5FF"/>
                 <w:sz w:val="14"/>
               </w:rPr>
               <w:t>Per-Modality</w:t>
@@ -179,7 +179,7 @@
             </w:r>
             <w:r>
               <w:rPr>
-                <w:color w:val="00C8FF"/>
+                <w:color w:val="00E5FF"/>
                 <w:sz w:val="14"/>
               </w:rPr>
               <w:t>Off-Grid</w:t>
@@ -209,7 +209,7 @@
             </w:r>
             <w:r>
               <w:rPr>
-                <w:color w:val="00C8FF"/>
+                <w:color w:val="00E5FF"/>
                 <w:sz w:val="14"/>
               </w:rPr>
               <w:t>Zero Cloud</w:t>
@@ -239,7 +239,7 @@
             </w:r>
             <w:r>
               <w:rPr>
-                <w:color w:val="00C8FF"/>
+                <w:color w:val="00E5FF"/>
                 <w:sz w:val="14"/>
               </w:rPr>
               <w:t>Jan Aushadhi</w:t>
@@ -269,7 +269,7 @@
             </w:r>
             <w:r>
               <w:rPr>
-                <w:color w:val="00C8FF"/>
+                <w:color w:val="00E5FF"/>
                 <w:sz w:val="14"/>
               </w:rPr>
               <w:t>EXIT CODE 0</w:t>

</xml_diff>